<commit_message>
Enhance resume and experience documentation for clarity and accuracy
- Updated experience entries to reflect accurate roles and contributions, emphasizing freelance work and collaboration with studios.
- Revised project summaries to clarify individual contributions and ongoing support, ensuring transparency in historical team efforts.
- Improved skill listings by adding TanStack Query and Ant Design, and updated learning labels for consistency.
- Adjusted resume files in both English and Persian to align with the latest changes in experience and project details.
</commit_message>
<xml_diff>
--- a/frontend/public/resume/hossein-khalili-resume-en.docx
+++ b/frontend/public/resume/hossein-khalili-resume-en.docx
@@ -152,7 +152,7 @@
           <w:color w:val="1A1A1A"/>
           <w:sz w:val="21"/>
         </w:rPr>
-        <w:t>Senior frontend engineer (since 2018) for complex production web applications. I build React / Next.js / TypeScript UIs for real-time trading, crypto and fintech products, multi-role dashboards, and data-heavy admin tools — with WebSocket, Socket.io, and SignalR wired into reliable client state (Redux, Zustand, TanStack Query). Owns frontend architecture from landing through authenticated product surfaces. Expanding into full-stack with NestJS on real projects — learning and shipping, not claiming backend expertise.</w:t>
+        <w:t>Senior frontend engineer (since 2018) for complex production web applications. I build React / Next.js / TypeScript UIs for real-time trading, crypto and fintech products, multi-role dashboards, and data-heavy admin tools — with WebSocket, Socket.io, and SignalR wired into reliable client state (Redux, Zustand, TanStack Query). Freelance frontend: owns the frontend implementation from landing through authenticated product surfaces; other tech and design members are a team. Building with NestJS on small practice projects — learning the backend path, not a shipped production backend.</w:t>
       </w:r>
     </w:p>
     <w:p>
@@ -298,7 +298,7 @@
           <w:color w:val="1B365D"/>
           <w:sz w:val="21"/>
         </w:rPr>
-        <w:t xml:space="preserve">Learning  </w:t>
+        <w:t xml:space="preserve">Building with  </w:t>
       </w:r>
       <w:r>
         <w:rPr>
@@ -464,7 +464,7 @@
           <w:color w:val="1A1A1A"/>
           <w:sz w:val="21"/>
         </w:rPr>
-        <w:t>Built the full frontend for an AI customer-service product (teechats.com): embeddable widget (AI assistant with business rules and human handoff) plus admin for rules, analytics, and live-support takeover.</w:t>
+        <w:t>Frontend for an AI shopping-guide bot for e-commerce stores, shipped as a Wix plugin (teechats.com). The bot uses the store’s products plus defined rules and extra rules the merchant adds so guidance is store-specific — to speed sales and walk the customer through buying.</w:t>
       </w:r>
     </w:p>
     <w:p>
@@ -479,7 +479,7 @@
           <w:color w:val="1A1A1A"/>
           <w:sz w:val="21"/>
         </w:rPr>
-        <w:t>Real-time chat UI with SignalR — typing indicators, message queue, and RBAC-aware roles (React, TypeScript, Zustand).</w:t>
+        <w:t>Real-time chat UI with SignalR — typing indicators, message queue, and RBAC-aware roles (React, TypeScript, Zustand). Separate engagement from Graphay Octopus work.</w:t>
       </w:r>
     </w:p>
     <w:p>
@@ -549,7 +549,7 @@
           <w:color w:val="1A1A1A"/>
           <w:sz w:val="21"/>
         </w:rPr>
-        <w:t>Led frontend architecture for arz.me (barman-tech / Graphay): SEO landing and authenticated exchange app — wallet, buy/sell, live prices, support. Socket.io market feeds; Next.js, TypeScript, Zustand, TanStack Query.</w:t>
+        <w:t>As a freelance frontend developer I built the full frontend for arz.me myself — public landing and authenticated exchange app (wallet, buy/sell, live prices, support) — through barman-tech / Graphay; other disciplines were a team. Socket.io market feeds; Next.js, TypeScript, Zustand, TanStack Query.</w:t>
       </w:r>
     </w:p>
     <w:p>
@@ -564,7 +564,22 @@
           <w:color w:val="1A1A1A"/>
           <w:sz w:val="21"/>
         </w:rPr>
-        <w:t>Frontend for AI chatbot products (Llama / OpenAI) — real-time chat UIs, image-processing integrations, and related Graphay Octopus plugin surfaces.</w:t>
+        <w:t>Octopus AI — Graphay freelance product, ChatGPT-like but more specialized at the time: generate video, Excel files, and research, plus plugins added by writing Python scripts (when that was not yet trivial in ChatGPT).</w:t>
+      </w:r>
+    </w:p>
+    <w:p>
+      <w:pPr>
+        <w:pStyle w:val="ListBullet"/>
+        <w:spacing w:before="0" w:after="20" w:line="230" w:lineRule="auto"/>
+      </w:pPr>
+      <w:r>
+        <w:rPr>
+          <w:rFonts w:ascii="Calibri" w:hAnsi="Calibri" w:eastAsia="Calibri" w:cs="Calibri"/>
+          <w:b w:val="0"/>
+          <w:color w:val="1A1A1A"/>
+          <w:sz w:val="21"/>
+        </w:rPr>
+        <w:t>Frontend for other Graphay AI work (Llama / OpenAI chat UIs and image-processing integrations).</w:t>
       </w:r>
     </w:p>
     <w:p>
@@ -584,61 +599,6 @@
     </w:p>
     <w:p>
       <w:pPr>
-        <w:spacing w:before="80" w:after="0" w:line="220" w:lineRule="auto"/>
-      </w:pPr>
-      <w:r>
-        <w:rPr>
-          <w:rFonts w:ascii="Calibri" w:hAnsi="Calibri" w:eastAsia="Calibri" w:cs="Calibri"/>
-          <w:b/>
-          <w:color w:val="1A1A1A"/>
-          <w:sz w:val="22"/>
-        </w:rPr>
-        <w:t>Detifi</w:t>
-      </w:r>
-      <w:r>
-        <w:rPr>
-          <w:rFonts w:ascii="Calibri" w:hAnsi="Calibri" w:eastAsia="Calibri" w:cs="Calibri"/>
-          <w:b w:val="0"/>
-          <w:color w:val="1A1A1A"/>
-          <w:sz w:val="20"/>
-        </w:rPr>
-        <w:t xml:space="preserve">    </w:t>
-      </w:r>
-      <w:r>
-        <w:rPr>
-          <w:rFonts w:ascii="Calibri" w:hAnsi="Calibri" w:eastAsia="Calibri" w:cs="Calibri"/>
-          <w:b/>
-          <w:color w:val="4B5563"/>
-          <w:sz w:val="20"/>
-        </w:rPr>
-        <w:t>Mar 2024 – Aug 2024</w:t>
-      </w:r>
-    </w:p>
-    <w:p>
-      <w:pPr>
-        <w:spacing w:before="0" w:after="20" w:line="220" w:lineRule="auto"/>
-      </w:pPr>
-      <w:r>
-        <w:rPr>
-          <w:rFonts w:ascii="Calibri" w:hAnsi="Calibri" w:eastAsia="Calibri" w:cs="Calibri"/>
-          <w:b/>
-          <w:color w:val="1B365D"/>
-          <w:sz w:val="21"/>
-        </w:rPr>
-        <w:t>Senior Frontend Developer, Contract</w:t>
-      </w:r>
-      <w:r>
-        <w:rPr>
-          <w:rFonts w:ascii="Calibri" w:hAnsi="Calibri" w:eastAsia="Calibri" w:cs="Calibri"/>
-          <w:b w:val="0"/>
-          <w:color w:val="4B5563"/>
-          <w:sz w:val="20"/>
-        </w:rPr>
-        <w:t xml:space="preserve">  ·  London Area, UK</w:t>
-      </w:r>
-    </w:p>
-    <w:p>
-      <w:pPr>
         <w:pStyle w:val="ListBullet"/>
         <w:spacing w:before="0" w:after="20" w:line="230" w:lineRule="auto"/>
       </w:pPr>
@@ -649,7 +609,7 @@
           <w:color w:val="1A1A1A"/>
           <w:sz w:val="21"/>
         </w:rPr>
-        <w:t>Frontend for an AI crypto-research product (insights, chatbot, landing), including UX/accessibility on data-heavy investor screens. React / JavaScript frontend — not independent market analysis.</w:t>
+        <w:t>Detifi — a Graphay AI crypto-research product (insights, chatbot, landing) that was stopped; same founder as Graphay. Frontend only — not a separate employer.</w:t>
       </w:r>
     </w:p>
     <w:p>
@@ -789,7 +749,7 @@
           <w:color w:val="1A1A1A"/>
           <w:sz w:val="21"/>
         </w:rPr>
-        <w:t>Built the Ronda24 hypermarket PWA (Next.js, Tailwind): customer shopping plus organization and logistics panels.</w:t>
+        <w:t>Built the Ronda24 hypermarket PWA (Arsal Web) with Next.js and Tailwind: customer shopping plus organization and logistics panels.</w:t>
       </w:r>
     </w:p>
     <w:p>
@@ -819,7 +779,7 @@
           <w:color w:val="1A1A1A"/>
           <w:sz w:val="21"/>
         </w:rPr>
-        <w:t>Shipped two PWA features — shopping history and repurchase of a previous cart — associated with about a 10% sales increase.</w:t>
+        <w:t>Shipped two PWA features — shopping history and repurchase of a previous cart.</w:t>
       </w:r>
     </w:p>
     <w:p>
@@ -979,161 +939,6 @@
     </w:p>
     <w:p>
       <w:pPr>
-        <w:spacing w:before="80" w:after="0" w:line="220" w:lineRule="auto"/>
-      </w:pPr>
-      <w:r>
-        <w:rPr>
-          <w:rFonts w:ascii="Calibri" w:hAnsi="Calibri" w:eastAsia="Calibri" w:cs="Calibri"/>
-          <w:b/>
-          <w:color w:val="1A1A1A"/>
-          <w:sz w:val="22"/>
-        </w:rPr>
-        <w:t>alborztd.ir</w:t>
-      </w:r>
-      <w:r>
-        <w:rPr>
-          <w:rFonts w:ascii="Calibri" w:hAnsi="Calibri" w:eastAsia="Calibri" w:cs="Calibri"/>
-          <w:b w:val="0"/>
-          <w:color w:val="1A1A1A"/>
-          <w:sz w:val="20"/>
-        </w:rPr>
-        <w:t xml:space="preserve">    </w:t>
-      </w:r>
-      <w:r>
-        <w:rPr>
-          <w:rFonts w:ascii="Calibri" w:hAnsi="Calibri" w:eastAsia="Calibri" w:cs="Calibri"/>
-          <w:b/>
-          <w:color w:val="4B5563"/>
-          <w:sz w:val="20"/>
-        </w:rPr>
-        <w:t>Dec 2018 – Sep 2020</w:t>
-      </w:r>
-    </w:p>
-    <w:p>
-      <w:pPr>
-        <w:spacing w:before="0" w:after="20" w:line="220" w:lineRule="auto"/>
-      </w:pPr>
-      <w:r>
-        <w:rPr>
-          <w:rFonts w:ascii="Calibri" w:hAnsi="Calibri" w:eastAsia="Calibri" w:cs="Calibri"/>
-          <w:b/>
-          <w:color w:val="1B365D"/>
-          <w:sz w:val="21"/>
-        </w:rPr>
-        <w:t>Frontend Web Developer</w:t>
-      </w:r>
-      <w:r>
-        <w:rPr>
-          <w:rFonts w:ascii="Calibri" w:hAnsi="Calibri" w:eastAsia="Calibri" w:cs="Calibri"/>
-          <w:b w:val="0"/>
-          <w:color w:val="4B5563"/>
-          <w:sz w:val="20"/>
-        </w:rPr>
-        <w:t xml:space="preserve">  ·  On-site · Sari, Mazandaran, Iran</w:t>
-      </w:r>
-    </w:p>
-    <w:p>
-      <w:pPr>
-        <w:pStyle w:val="ListBullet"/>
-        <w:spacing w:before="0" w:after="20" w:line="230" w:lineRule="auto"/>
-      </w:pPr>
-      <w:r>
-        <w:rPr>
-          <w:rFonts w:ascii="Calibri" w:hAnsi="Calibri" w:eastAsia="Calibri" w:cs="Calibri"/>
-          <w:b w:val="0"/>
-          <w:color w:val="1A1A1A"/>
-          <w:sz w:val="21"/>
-        </w:rPr>
-        <w:t>Frontend for a narcotic-drug control application for Mazandaran province, used by 400+ centers and 20,000+ patients.</w:t>
-      </w:r>
-    </w:p>
-    <w:p>
-      <w:pPr>
-        <w:pStyle w:val="ListBullet"/>
-        <w:spacing w:before="0" w:after="20" w:line="230" w:lineRule="auto"/>
-      </w:pPr>
-      <w:r>
-        <w:rPr>
-          <w:rFonts w:ascii="Calibri" w:hAnsi="Calibri" w:eastAsia="Calibri" w:cs="Calibri"/>
-          <w:b w:val="0"/>
-          <w:color w:val="1A1A1A"/>
-          <w:sz w:val="21"/>
-        </w:rPr>
-        <w:t>Appointment UI for patients to receive medicines; monthly consumption checks; per-center consumption reporting (HTML, CSS, jQuery).</w:t>
-      </w:r>
-    </w:p>
-    <w:p>
-      <w:pPr>
-        <w:spacing w:before="80" w:after="0" w:line="220" w:lineRule="auto"/>
-      </w:pPr>
-      <w:r>
-        <w:rPr>
-          <w:rFonts w:ascii="Calibri" w:hAnsi="Calibri" w:eastAsia="Calibri" w:cs="Calibri"/>
-          <w:b/>
-          <w:color w:val="1A1A1A"/>
-          <w:sz w:val="22"/>
-        </w:rPr>
-        <w:t>alborztd.ir</w:t>
-      </w:r>
-      <w:r>
-        <w:rPr>
-          <w:rFonts w:ascii="Calibri" w:hAnsi="Calibri" w:eastAsia="Calibri" w:cs="Calibri"/>
-          <w:b w:val="0"/>
-          <w:color w:val="1A1A1A"/>
-          <w:sz w:val="20"/>
-        </w:rPr>
-        <w:t xml:space="preserve">    </w:t>
-      </w:r>
-      <w:r>
-        <w:rPr>
-          <w:rFonts w:ascii="Calibri" w:hAnsi="Calibri" w:eastAsia="Calibri" w:cs="Calibri"/>
-          <w:b/>
-          <w:color w:val="4B5563"/>
-          <w:sz w:val="20"/>
-        </w:rPr>
-        <w:t>Aug 2016 – May 2017</w:t>
-      </w:r>
-    </w:p>
-    <w:p>
-      <w:pPr>
-        <w:spacing w:before="0" w:after="20" w:line="220" w:lineRule="auto"/>
-      </w:pPr>
-      <w:r>
-        <w:rPr>
-          <w:rFonts w:ascii="Calibri" w:hAnsi="Calibri" w:eastAsia="Calibri" w:cs="Calibri"/>
-          <w:b/>
-          <w:color w:val="1B365D"/>
-          <w:sz w:val="21"/>
-        </w:rPr>
-        <w:t>Frontend Web Developer</w:t>
-      </w:r>
-      <w:r>
-        <w:rPr>
-          <w:rFonts w:ascii="Calibri" w:hAnsi="Calibri" w:eastAsia="Calibri" w:cs="Calibri"/>
-          <w:b w:val="0"/>
-          <w:color w:val="4B5563"/>
-          <w:sz w:val="20"/>
-        </w:rPr>
-        <w:t xml:space="preserve">  ·  Sari, Mazandaran, Iran</w:t>
-      </w:r>
-    </w:p>
-    <w:p>
-      <w:pPr>
-        <w:pStyle w:val="ListBullet"/>
-        <w:spacing w:before="0" w:after="20" w:line="230" w:lineRule="auto"/>
-      </w:pPr>
-      <w:r>
-        <w:rPr>
-          <w:rFonts w:ascii="Calibri" w:hAnsi="Calibri" w:eastAsia="Calibri" w:cs="Calibri"/>
-          <w:b w:val="0"/>
-          <w:color w:val="1A1A1A"/>
-          <w:sz w:val="21"/>
-        </w:rPr>
-        <w:t>Frontend web development with HTML and CSS. Earlier tenure at the same company.</w:t>
-      </w:r>
-    </w:p>
-    <w:p>
-      <w:pPr>
         <w:spacing w:before="160" w:after="60" w:line="216" w:lineRule="auto"/>
         <w:pBdr>
           <w:bottom w:val="single" w:sz="8" w:space="4" w:color="CBD5E1"/>
@@ -1193,7 +998,7 @@
           <w:color w:val="1A1A1A"/>
           <w:sz w:val="21"/>
         </w:rPr>
-        <w:t>Led frontend architecture from scratch: public landing + authenticated trading (wallet, buy/sell, support). Socket.io live markets. Next.js, TypeScript, Zustand, TanStack Query.</w:t>
+        <w:t>Freelance frontend: I built the full arz.me frontend myself (landing + authenticated exchange) through barman-tech / Graphay; other disciplines were a team. Socket.io live markets. Next.js, TypeScript, Zustand, TanStack Query.</w:t>
       </w:r>
     </w:p>
     <w:p>
@@ -1240,7 +1045,7 @@
           <w:color w:val="1A1A1A"/>
           <w:sz w:val="21"/>
         </w:rPr>
-        <w:t>User trading SPA (app.xpay.co), ops admin, and public digital receipts (viral-team). SignalR live updates, Redux Toolkit, Ant Design; RTL and Jalali date UX.</w:t>
+        <w:t>Contributed user trading SPA (app.xpay.co), ops admin, and public digital receipts (viral-team) — not a sole from-scratch build. Still supporting features, bugfixes, and frontend improvements. SignalR, Redux Toolkit, Ant Design; RTL and Jalali UX.</w:t>
       </w:r>
     </w:p>
     <w:p>
@@ -1268,7 +1073,7 @@
           <w:color w:val="1A1A1A"/>
           <w:sz w:val="21"/>
         </w:rPr>
-        <w:t>Admin, warehouse, basket-picker, postman, storefront, and PWA on one shared order domain. Next.js, Redux, TypeScript. Internal delivery — no public marketing URL.</w:t>
+        <w:t>Admin, warehouse, basket-picker, postman, storefront, and PWA on one shared order domain. Next.js, Redux, TypeScript. Confidential client work (NDA) — no public marketing URL and no client name.</w:t>
       </w:r>
     </w:p>
     <w:p>
@@ -1296,7 +1101,7 @@
           <w:color w:val="1A1A1A"/>
           <w:sz w:val="21"/>
         </w:rPr>
-        <w:t>VisaPay (visapay.me), SwapNet (swapnet.app), Adgame (miniapp.adgame.fun), Ariascale (ariascale.ir), PSPro (pspro.ir), Ketabfeed (ketabfeed.com), and internal exchange UI (EppoChange).</w:t>
+        <w:t>SwapNet (swapnet.app): full frontend, still supporting. VisaPay (visapay.me) and xpay.co: historical contribution plus ongoing tech-side support. Also Adgame (miniapp.adgame.fun), Ariascale (ariascale.ir), PSPro (pspro.ir), Ketabfeed (ketabfeed.com), and internal exchange UI (EppoChange).</w:t>
       </w:r>
     </w:p>
     <w:p>

</xml_diff>